<commit_message>
Improve guide candidate topic directions
</commit_message>
<xml_diff>
--- a/outputs/guide_review_pack/07_candidate_phd_topic_directions.docx
+++ b/outputs/guide_review_pack/07_candidate_phd_topic_directions.docx
@@ -37,7 +37,7 @@
     </w:p>
     <w:p>
       <w:r>
-        <w:t>The title should not be finalized before clinic data feasibility is confirmed. The current literature supports a direction, not a final wording.</w:t>
+        <w:t>The title should not be finalized before clinic data feasibility is confirmed. The current literature supports a strong direction, but the final wording must depend on outcome availability, data modality and validation feasibility.</w:t>
       </w:r>
     </w:p>
     <w:p>
@@ -45,7 +45,7 @@
         <w:pStyle w:val="Heading1"/>
       </w:pPr>
       <w:r>
-        <w:t>Candidate Directions</w:t>
+        <w:t>Why A Generic Title Is Weak</w:t>
       </w:r>
     </w:p>
     <w:tbl>
@@ -63,7 +63,302 @@
       <w:tr>
         <w:tc>
           <w:tcPr>
-            <w:tcW w:type="dxa" w:w="3168"/>
+            <w:tcW w:type="dxa" w:w="2592"/>
+            <w:shd w:fill="F2F4F7"/>
+            <w:vAlign w:val="center"/>
+          </w:tcPr>
+          <w:p>
+            <w:pPr>
+              <w:spacing w:after="0"/>
+            </w:pPr>
+            <w:r/>
+            <w:r>
+              <w:rPr>
+                <w:rFonts w:ascii="Calibri" w:hAnsi="Calibri"/>
+                <w:b/>
+                <w:sz w:val="18"/>
+              </w:rPr>
+              <w:t>Weak Title Direction</w:t>
+            </w:r>
+          </w:p>
+        </w:tc>
+        <w:tc>
+          <w:tcPr>
+            <w:tcW w:type="dxa" w:w="3240"/>
+            <w:shd w:fill="F2F4F7"/>
+            <w:vAlign w:val="center"/>
+          </w:tcPr>
+          <w:p>
+            <w:pPr>
+              <w:spacing w:after="0"/>
+            </w:pPr>
+            <w:r/>
+            <w:r>
+              <w:rPr>
+                <w:rFonts w:ascii="Calibri" w:hAnsi="Calibri"/>
+                <w:b/>
+                <w:sz w:val="18"/>
+              </w:rPr>
+              <w:t>Why It Is Weak</w:t>
+            </w:r>
+          </w:p>
+        </w:tc>
+        <w:tc>
+          <w:tcPr>
+            <w:tcW w:type="dxa" w:w="3240"/>
+            <w:shd w:fill="F2F4F7"/>
+            <w:vAlign w:val="center"/>
+          </w:tcPr>
+          <w:p>
+            <w:pPr>
+              <w:spacing w:after="0"/>
+            </w:pPr>
+            <w:r/>
+            <w:r>
+              <w:rPr>
+                <w:rFonts w:ascii="Calibri" w:hAnsi="Calibri"/>
+                <w:b/>
+                <w:sz w:val="18"/>
+              </w:rPr>
+              <w:t>Stronger Direction</w:t>
+            </w:r>
+          </w:p>
+        </w:tc>
+      </w:tr>
+      <w:tr>
+        <w:tc>
+          <w:tcPr>
+            <w:tcW w:type="dxa" w:w="2592"/>
+            <w:vAlign w:val="center"/>
+          </w:tcPr>
+          <w:p>
+            <w:pPr>
+              <w:spacing w:after="0"/>
+            </w:pPr>
+            <w:r/>
+            <w:r>
+              <w:rPr>
+                <w:rFonts w:ascii="Calibri" w:hAnsi="Calibri"/>
+                <w:b w:val="0"/>
+                <w:sz w:val="18"/>
+              </w:rPr>
+              <w:t>Machine Learning Model for IVF Success Prediction</w:t>
+            </w:r>
+          </w:p>
+        </w:tc>
+        <w:tc>
+          <w:tcPr>
+            <w:tcW w:type="dxa" w:w="3240"/>
+            <w:vAlign w:val="center"/>
+          </w:tcPr>
+          <w:p>
+            <w:pPr>
+              <w:spacing w:after="0"/>
+            </w:pPr>
+            <w:r/>
+            <w:r>
+              <w:rPr>
+                <w:rFonts w:ascii="Calibri" w:hAnsi="Calibri"/>
+                <w:b w:val="0"/>
+                <w:sz w:val="18"/>
+              </w:rPr>
+              <w:t>Many papers already build IVF prediction models; this sounds like a classifier-comparison study.</w:t>
+            </w:r>
+          </w:p>
+        </w:tc>
+        <w:tc>
+          <w:tcPr>
+            <w:tcW w:type="dxa" w:w="3240"/>
+            <w:vAlign w:val="center"/>
+          </w:tcPr>
+          <w:p>
+            <w:pPr>
+              <w:spacing w:after="0"/>
+            </w:pPr>
+            <w:r/>
+            <w:r>
+              <w:rPr>
+                <w:rFonts w:ascii="Calibri" w:hAnsi="Calibri"/>
+                <w:b w:val="0"/>
+                <w:sz w:val="18"/>
+              </w:rPr>
+              <w:t>Explainable, personalized and clinically usable decision support for IVF outcome prediction.</w:t>
+            </w:r>
+          </w:p>
+        </w:tc>
+      </w:tr>
+      <w:tr>
+        <w:tc>
+          <w:tcPr>
+            <w:tcW w:type="dxa" w:w="2592"/>
+            <w:vAlign w:val="center"/>
+          </w:tcPr>
+          <w:p>
+            <w:pPr>
+              <w:spacing w:after="0"/>
+            </w:pPr>
+            <w:r/>
+            <w:r>
+              <w:rPr>
+                <w:rFonts w:ascii="Calibri" w:hAnsi="Calibri"/>
+                <w:b w:val="0"/>
+                <w:sz w:val="18"/>
+              </w:rPr>
+              <w:t>Deep Learning for IVF Prediction</w:t>
+            </w:r>
+          </w:p>
+        </w:tc>
+        <w:tc>
+          <w:tcPr>
+            <w:tcW w:type="dxa" w:w="3240"/>
+            <w:vAlign w:val="center"/>
+          </w:tcPr>
+          <w:p>
+            <w:pPr>
+              <w:spacing w:after="0"/>
+            </w:pPr>
+            <w:r/>
+            <w:r>
+              <w:rPr>
+                <w:rFonts w:ascii="Calibri" w:hAnsi="Calibri"/>
+                <w:b w:val="0"/>
+                <w:sz w:val="18"/>
+              </w:rPr>
+              <w:t>Deep learning is data-dependent and should not be promised without image/time-lapse or large-scale data.</w:t>
+            </w:r>
+          </w:p>
+        </w:tc>
+        <w:tc>
+          <w:tcPr>
+            <w:tcW w:type="dxa" w:w="3240"/>
+            <w:vAlign w:val="center"/>
+          </w:tcPr>
+          <w:p>
+            <w:pPr>
+              <w:spacing w:after="0"/>
+            </w:pPr>
+            <w:r/>
+            <w:r>
+              <w:rPr>
+                <w:rFonts w:ascii="Calibri" w:hAnsi="Calibri"/>
+                <w:b w:val="0"/>
+                <w:sz w:val="18"/>
+              </w:rPr>
+              <w:t>Use deep learning only as a conditional method if the dataset justifies it.</w:t>
+            </w:r>
+          </w:p>
+        </w:tc>
+      </w:tr>
+      <w:tr>
+        <w:tc>
+          <w:tcPr>
+            <w:tcW w:type="dxa" w:w="2592"/>
+            <w:vAlign w:val="center"/>
+          </w:tcPr>
+          <w:p>
+            <w:pPr>
+              <w:spacing w:after="0"/>
+            </w:pPr>
+            <w:r/>
+            <w:r>
+              <w:rPr>
+                <w:rFonts w:ascii="Calibri" w:hAnsi="Calibri"/>
+                <w:b w:val="0"/>
+                <w:sz w:val="18"/>
+              </w:rPr>
+              <w:t>AI to Improve IVF Success</w:t>
+            </w:r>
+          </w:p>
+        </w:tc>
+        <w:tc>
+          <w:tcPr>
+            <w:tcW w:type="dxa" w:w="3240"/>
+            <w:vAlign w:val="center"/>
+          </w:tcPr>
+          <w:p>
+            <w:pPr>
+              <w:spacing w:after="0"/>
+            </w:pPr>
+            <w:r/>
+            <w:r>
+              <w:rPr>
+                <w:rFonts w:ascii="Calibri" w:hAnsi="Calibri"/>
+                <w:b w:val="0"/>
+                <w:sz w:val="18"/>
+              </w:rPr>
+              <w:t>Improved success requires prospective clinical outcome evidence.</w:t>
+            </w:r>
+          </w:p>
+        </w:tc>
+        <w:tc>
+          <w:tcPr>
+            <w:tcW w:type="dxa" w:w="3240"/>
+            <w:vAlign w:val="center"/>
+          </w:tcPr>
+          <w:p>
+            <w:pPr>
+              <w:spacing w:after="0"/>
+            </w:pPr>
+            <w:r/>
+            <w:r>
+              <w:rPr>
+                <w:rFonts w:ascii="Calibri" w:hAnsi="Calibri"/>
+                <w:b w:val="0"/>
+                <w:sz w:val="18"/>
+              </w:rPr>
+              <w:t>AI-assisted prediction, explanation and counseling support.</w:t>
+            </w:r>
+          </w:p>
+        </w:tc>
+      </w:tr>
+    </w:tbl>
+    <w:p/>
+    <w:p>
+      <w:pPr>
+        <w:pStyle w:val="Heading1"/>
+      </w:pPr>
+      <w:r>
+        <w:t>Candidate Directions</w:t>
+      </w:r>
+    </w:p>
+    <w:tbl>
+      <w:tblPr>
+        <w:tblStyle w:val="TableGrid"/>
+        <w:tblW w:type="auto" w:w="0"/>
+        <w:jc w:val="center"/>
+        <w:tblLook w:firstColumn="1" w:firstRow="1" w:lastColumn="0" w:lastRow="0" w:noHBand="0" w:noVBand="1" w:val="04A0"/>
+      </w:tblPr>
+      <w:tblGrid>
+        <w:gridCol w:w="2340"/>
+        <w:gridCol w:w="2340"/>
+        <w:gridCol w:w="2340"/>
+        <w:gridCol w:w="2340"/>
+      </w:tblGrid>
+      <w:tr>
+        <w:tc>
+          <w:tcPr>
+            <w:tcW w:type="dxa" w:w="792"/>
+            <w:shd w:fill="F2F4F7"/>
+            <w:vAlign w:val="center"/>
+          </w:tcPr>
+          <w:p>
+            <w:pPr>
+              <w:spacing w:after="0"/>
+            </w:pPr>
+            <w:r/>
+            <w:r>
+              <w:rPr>
+                <w:rFonts w:ascii="Calibri" w:hAnsi="Calibri"/>
+                <w:b/>
+                <w:sz w:val="18"/>
+              </w:rPr>
+              <w:t>Rank</w:t>
+            </w:r>
+          </w:p>
+        </w:tc>
+        <w:tc>
+          <w:tcPr>
+            <w:tcW w:type="dxa" w:w="3240"/>
             <w:shd w:fill="F2F4F7"/>
             <w:vAlign w:val="center"/>
           </w:tcPr>
@@ -84,7 +379,7 @@
         </w:tc>
         <w:tc>
           <w:tcPr>
-            <w:tcW w:type="dxa" w:w="2880"/>
+            <w:tcW w:type="dxa" w:w="2952"/>
             <w:shd w:fill="F2F4F7"/>
             <w:vAlign w:val="center"/>
           </w:tcPr>
@@ -99,13 +394,13 @@
                 <w:b/>
                 <w:sz w:val="18"/>
               </w:rPr>
-              <w:t>Strength</w:t>
+              <w:t>Evidence Support</w:t>
             </w:r>
           </w:p>
         </w:tc>
         <w:tc>
           <w:tcPr>
-            <w:tcW w:type="dxa" w:w="3024"/>
+            <w:tcW w:type="dxa" w:w="2088"/>
             <w:shd w:fill="F2F4F7"/>
             <w:vAlign w:val="center"/>
           </w:tcPr>
@@ -128,7 +423,27 @@
       <w:tr>
         <w:tc>
           <w:tcPr>
-            <w:tcW w:type="dxa" w:w="3168"/>
+            <w:tcW w:type="dxa" w:w="792"/>
+            <w:vAlign w:val="center"/>
+          </w:tcPr>
+          <w:p>
+            <w:pPr>
+              <w:spacing w:after="0"/>
+            </w:pPr>
+            <w:r/>
+            <w:r>
+              <w:rPr>
+                <w:rFonts w:ascii="Calibri" w:hAnsi="Calibri"/>
+                <w:b w:val="0"/>
+                <w:sz w:val="18"/>
+              </w:rPr>
+              <w:t>1</w:t>
+            </w:r>
+          </w:p>
+        </w:tc>
+        <w:tc>
+          <w:tcPr>
+            <w:tcW w:type="dxa" w:w="3240"/>
             <w:vAlign w:val="center"/>
           </w:tcPr>
           <w:p>
@@ -148,7 +463,7 @@
         </w:tc>
         <w:tc>
           <w:tcPr>
-            <w:tcW w:type="dxa" w:w="2880"/>
+            <w:tcW w:type="dxa" w:w="2952"/>
             <w:vAlign w:val="center"/>
           </w:tcPr>
           <w:p>
@@ -162,13 +477,13 @@
                 <w:b w:val="0"/>
                 <w:sz w:val="18"/>
               </w:rPr>
-              <w:t>Best overall fit with repeated gaps: XAI, CDSS, personalization and validation.</w:t>
+              <w:t>Best overall fit with repeated gaps: XAI, CDSS, personalization, validation and clinical usefulness.</w:t>
             </w:r>
           </w:p>
         </w:tc>
         <w:tc>
           <w:tcPr>
-            <w:tcW w:type="dxa" w:w="3024"/>
+            <w:tcW w:type="dxa" w:w="2088"/>
             <w:vAlign w:val="center"/>
           </w:tcPr>
           <w:p>
@@ -190,7 +505,27 @@
       <w:tr>
         <w:tc>
           <w:tcPr>
-            <w:tcW w:type="dxa" w:w="3168"/>
+            <w:tcW w:type="dxa" w:w="792"/>
+            <w:vAlign w:val="center"/>
+          </w:tcPr>
+          <w:p>
+            <w:pPr>
+              <w:spacing w:after="0"/>
+            </w:pPr>
+            <w:r/>
+            <w:r>
+              <w:rPr>
+                <w:rFonts w:ascii="Calibri" w:hAnsi="Calibri"/>
+                <w:b w:val="0"/>
+                <w:sz w:val="18"/>
+              </w:rPr>
+              <w:t>2</w:t>
+            </w:r>
+          </w:p>
+        </w:tc>
+        <w:tc>
+          <w:tcPr>
+            <w:tcW w:type="dxa" w:w="3240"/>
             <w:vAlign w:val="center"/>
           </w:tcPr>
           <w:p>
@@ -210,7 +545,7 @@
         </w:tc>
         <w:tc>
           <w:tcPr>
-            <w:tcW w:type="dxa" w:w="2880"/>
+            <w:tcW w:type="dxa" w:w="2952"/>
             <w:vAlign w:val="center"/>
           </w:tcPr>
           <w:p>
@@ -230,7 +565,7 @@
         </w:tc>
         <w:tc>
           <w:tcPr>
-            <w:tcW w:type="dxa" w:w="3024"/>
+            <w:tcW w:type="dxa" w:w="2088"/>
             <w:vAlign w:val="center"/>
           </w:tcPr>
           <w:p>
@@ -252,7 +587,109 @@
       <w:tr>
         <w:tc>
           <w:tcPr>
-            <w:tcW w:type="dxa" w:w="3168"/>
+            <w:tcW w:type="dxa" w:w="792"/>
+            <w:vAlign w:val="center"/>
+          </w:tcPr>
+          <w:p>
+            <w:pPr>
+              <w:spacing w:after="0"/>
+            </w:pPr>
+            <w:r/>
+            <w:r>
+              <w:rPr>
+                <w:rFonts w:ascii="Calibri" w:hAnsi="Calibri"/>
+                <w:b w:val="0"/>
+                <w:sz w:val="18"/>
+              </w:rPr>
+              <w:t>3</w:t>
+            </w:r>
+          </w:p>
+        </w:tc>
+        <w:tc>
+          <w:tcPr>
+            <w:tcW w:type="dxa" w:w="3240"/>
+            <w:vAlign w:val="center"/>
+          </w:tcPr>
+          <w:p>
+            <w:pPr>
+              <w:spacing w:after="0"/>
+            </w:pPr>
+            <w:r/>
+            <w:r>
+              <w:rPr>
+                <w:rFonts w:ascii="Calibri" w:hAnsi="Calibri"/>
+                <w:b w:val="0"/>
+                <w:sz w:val="18"/>
+              </w:rPr>
+              <w:t>Explainable multimodal IVF prediction using clinical and embryological data.</w:t>
+            </w:r>
+          </w:p>
+        </w:tc>
+        <w:tc>
+          <w:tcPr>
+            <w:tcW w:type="dxa" w:w="2952"/>
+            <w:vAlign w:val="center"/>
+          </w:tcPr>
+          <w:p>
+            <w:pPr>
+              <w:spacing w:after="0"/>
+            </w:pPr>
+            <w:r/>
+            <w:r>
+              <w:rPr>
+                <w:rFonts w:ascii="Calibri" w:hAnsi="Calibri"/>
+                <w:b w:val="0"/>
+                <w:sz w:val="18"/>
+              </w:rPr>
+              <w:t>Strong if structured embryology variables are available; supports multimodal theme.</w:t>
+            </w:r>
+          </w:p>
+        </w:tc>
+        <w:tc>
+          <w:tcPr>
+            <w:tcW w:type="dxa" w:w="2088"/>
+            <w:vAlign w:val="center"/>
+          </w:tcPr>
+          <w:p>
+            <w:pPr>
+              <w:spacing w:after="0"/>
+            </w:pPr>
+            <w:r/>
+            <w:r>
+              <w:rPr>
+                <w:rFonts w:ascii="Calibri" w:hAnsi="Calibri"/>
+                <w:b w:val="0"/>
+                <w:sz w:val="18"/>
+              </w:rPr>
+              <w:t>Cannot be used if embryology data are unavailable or incomplete.</w:t>
+            </w:r>
+          </w:p>
+        </w:tc>
+      </w:tr>
+      <w:tr>
+        <w:tc>
+          <w:tcPr>
+            <w:tcW w:type="dxa" w:w="792"/>
+            <w:vAlign w:val="center"/>
+          </w:tcPr>
+          <w:p>
+            <w:pPr>
+              <w:spacing w:after="0"/>
+            </w:pPr>
+            <w:r/>
+            <w:r>
+              <w:rPr>
+                <w:rFonts w:ascii="Calibri" w:hAnsi="Calibri"/>
+                <w:b w:val="0"/>
+                <w:sz w:val="18"/>
+              </w:rPr>
+              <w:t>4</w:t>
+            </w:r>
+          </w:p>
+        </w:tc>
+        <w:tc>
+          <w:tcPr>
+            <w:tcW w:type="dxa" w:w="3240"/>
             <w:vAlign w:val="center"/>
           </w:tcPr>
           <w:p>
@@ -272,7 +709,7 @@
         </w:tc>
         <w:tc>
           <w:tcPr>
-            <w:tcW w:type="dxa" w:w="2880"/>
+            <w:tcW w:type="dxa" w:w="2952"/>
             <w:vAlign w:val="center"/>
           </w:tcPr>
           <w:p>
@@ -292,7 +729,7 @@
         </w:tc>
         <w:tc>
           <w:tcPr>
-            <w:tcW w:type="dxa" w:w="3024"/>
+            <w:tcW w:type="dxa" w:w="2088"/>
             <w:vAlign w:val="center"/>
           </w:tcPr>
           <w:p>
@@ -314,7 +751,27 @@
       <w:tr>
         <w:tc>
           <w:tcPr>
-            <w:tcW w:type="dxa" w:w="3168"/>
+            <w:tcW w:type="dxa" w:w="792"/>
+            <w:vAlign w:val="center"/>
+          </w:tcPr>
+          <w:p>
+            <w:pPr>
+              <w:spacing w:after="0"/>
+            </w:pPr>
+            <w:r/>
+            <w:r>
+              <w:rPr>
+                <w:rFonts w:ascii="Calibri" w:hAnsi="Calibri"/>
+                <w:b w:val="0"/>
+                <w:sz w:val="18"/>
+              </w:rPr>
+              <w:t>5</w:t>
+            </w:r>
+          </w:p>
+        </w:tc>
+        <w:tc>
+          <w:tcPr>
+            <w:tcW w:type="dxa" w:w="3240"/>
             <w:vAlign w:val="center"/>
           </w:tcPr>
           <w:p>
@@ -334,7 +791,7 @@
         </w:tc>
         <w:tc>
           <w:tcPr>
-            <w:tcW w:type="dxa" w:w="2880"/>
+            <w:tcW w:type="dxa" w:w="2952"/>
             <w:vAlign w:val="center"/>
           </w:tcPr>
           <w:p>
@@ -354,7 +811,7 @@
         </w:tc>
         <w:tc>
           <w:tcPr>
-            <w:tcW w:type="dxa" w:w="3024"/>
+            <w:tcW w:type="dxa" w:w="2088"/>
             <w:vAlign w:val="center"/>
           </w:tcPr>
           <w:p>
@@ -369,6 +826,470 @@
                 <w:sz w:val="18"/>
               </w:rPr>
               <w:t>Depends heavily on access to Indian clinic data and live-birth outcome.</w:t>
+            </w:r>
+          </w:p>
+        </w:tc>
+      </w:tr>
+    </w:tbl>
+    <w:p/>
+    <w:p>
+      <w:r>
+        <w:br w:type="page"/>
+      </w:r>
+    </w:p>
+    <w:p>
+      <w:pPr>
+        <w:pStyle w:val="Heading1"/>
+      </w:pPr>
+      <w:r>
+        <w:t>Decision Matrix</w:t>
+      </w:r>
+    </w:p>
+    <w:tbl>
+      <w:tblPr>
+        <w:tblStyle w:val="TableGrid"/>
+        <w:tblW w:type="auto" w:w="0"/>
+        <w:jc w:val="center"/>
+        <w:tblLook w:firstColumn="1" w:firstRow="1" w:lastColumn="0" w:lastRow="0" w:noHBand="0" w:noVBand="1" w:val="04A0"/>
+      </w:tblPr>
+      <w:tblGrid>
+        <w:gridCol w:w="3120"/>
+        <w:gridCol w:w="3120"/>
+        <w:gridCol w:w="3120"/>
+      </w:tblGrid>
+      <w:tr>
+        <w:tc>
+          <w:tcPr>
+            <w:tcW w:type="dxa" w:w="2448"/>
+            <w:shd w:fill="F2F4F7"/>
+            <w:vAlign w:val="center"/>
+          </w:tcPr>
+          <w:p>
+            <w:pPr>
+              <w:spacing w:after="0"/>
+            </w:pPr>
+            <w:r/>
+            <w:r>
+              <w:rPr>
+                <w:rFonts w:ascii="Calibri" w:hAnsi="Calibri"/>
+                <w:b/>
+                <w:sz w:val="18"/>
+              </w:rPr>
+              <w:t>Decision Factor</w:t>
+            </w:r>
+          </w:p>
+        </w:tc>
+        <w:tc>
+          <w:tcPr>
+            <w:tcW w:type="dxa" w:w="3240"/>
+            <w:shd w:fill="F2F4F7"/>
+            <w:vAlign w:val="center"/>
+          </w:tcPr>
+          <w:p>
+            <w:pPr>
+              <w:spacing w:after="0"/>
+            </w:pPr>
+            <w:r/>
+            <w:r>
+              <w:rPr>
+                <w:rFonts w:ascii="Calibri" w:hAnsi="Calibri"/>
+                <w:b/>
+                <w:sz w:val="18"/>
+              </w:rPr>
+              <w:t>Best Current Choice</w:t>
+            </w:r>
+          </w:p>
+        </w:tc>
+        <w:tc>
+          <w:tcPr>
+            <w:tcW w:type="dxa" w:w="3384"/>
+            <w:shd w:fill="F2F4F7"/>
+            <w:vAlign w:val="center"/>
+          </w:tcPr>
+          <w:p>
+            <w:pPr>
+              <w:spacing w:after="0"/>
+            </w:pPr>
+            <w:r/>
+            <w:r>
+              <w:rPr>
+                <w:rFonts w:ascii="Calibri" w:hAnsi="Calibri"/>
+                <w:b/>
+                <w:sz w:val="18"/>
+              </w:rPr>
+              <w:t>Reason</w:t>
+            </w:r>
+          </w:p>
+        </w:tc>
+      </w:tr>
+      <w:tr>
+        <w:tc>
+          <w:tcPr>
+            <w:tcW w:type="dxa" w:w="2448"/>
+            <w:vAlign w:val="center"/>
+          </w:tcPr>
+          <w:p>
+            <w:pPr>
+              <w:spacing w:after="0"/>
+            </w:pPr>
+            <w:r/>
+            <w:r>
+              <w:rPr>
+                <w:rFonts w:ascii="Calibri" w:hAnsi="Calibri"/>
+                <w:b w:val="0"/>
+                <w:sz w:val="18"/>
+              </w:rPr>
+              <w:t>Academic novelty</w:t>
+            </w:r>
+          </w:p>
+        </w:tc>
+        <w:tc>
+          <w:tcPr>
+            <w:tcW w:type="dxa" w:w="3240"/>
+            <w:vAlign w:val="center"/>
+          </w:tcPr>
+          <w:p>
+            <w:pPr>
+              <w:spacing w:after="0"/>
+            </w:pPr>
+            <w:r/>
+            <w:r>
+              <w:rPr>
+                <w:rFonts w:ascii="Calibri" w:hAnsi="Calibri"/>
+                <w:b w:val="0"/>
+                <w:sz w:val="18"/>
+              </w:rPr>
+              <w:t>XAI + CDSS + validation-aware IVF prediction.</w:t>
+            </w:r>
+          </w:p>
+        </w:tc>
+        <w:tc>
+          <w:tcPr>
+            <w:tcW w:type="dxa" w:w="3384"/>
+            <w:vAlign w:val="center"/>
+          </w:tcPr>
+          <w:p>
+            <w:pPr>
+              <w:spacing w:after="0"/>
+            </w:pPr>
+            <w:r/>
+            <w:r>
+              <w:rPr>
+                <w:rFonts w:ascii="Calibri" w:hAnsi="Calibri"/>
+                <w:b w:val="0"/>
+                <w:sz w:val="18"/>
+              </w:rPr>
+              <w:t>Stronger than only comparing ML algorithms.</w:t>
+            </w:r>
+          </w:p>
+        </w:tc>
+      </w:tr>
+      <w:tr>
+        <w:tc>
+          <w:tcPr>
+            <w:tcW w:type="dxa" w:w="2448"/>
+            <w:vAlign w:val="center"/>
+          </w:tcPr>
+          <w:p>
+            <w:pPr>
+              <w:spacing w:after="0"/>
+            </w:pPr>
+            <w:r/>
+            <w:r>
+              <w:rPr>
+                <w:rFonts w:ascii="Calibri" w:hAnsi="Calibri"/>
+                <w:b w:val="0"/>
+                <w:sz w:val="18"/>
+              </w:rPr>
+              <w:t>Department fit</w:t>
+            </w:r>
+          </w:p>
+        </w:tc>
+        <w:tc>
+          <w:tcPr>
+            <w:tcW w:type="dxa" w:w="3240"/>
+            <w:vAlign w:val="center"/>
+          </w:tcPr>
+          <w:p>
+            <w:pPr>
+              <w:spacing w:after="0"/>
+            </w:pPr>
+            <w:r/>
+            <w:r>
+              <w:rPr>
+                <w:rFonts w:ascii="Calibri" w:hAnsi="Calibri"/>
+                <w:b w:val="0"/>
+                <w:sz w:val="18"/>
+              </w:rPr>
+              <w:t>Computer Applications with healthcare informatics and predictive analytics.</w:t>
+            </w:r>
+          </w:p>
+        </w:tc>
+        <w:tc>
+          <w:tcPr>
+            <w:tcW w:type="dxa" w:w="3384"/>
+            <w:vAlign w:val="center"/>
+          </w:tcPr>
+          <w:p>
+            <w:pPr>
+              <w:spacing w:after="0"/>
+            </w:pPr>
+            <w:r/>
+            <w:r>
+              <w:rPr>
+                <w:rFonts w:ascii="Calibri" w:hAnsi="Calibri"/>
+                <w:b w:val="0"/>
+                <w:sz w:val="18"/>
+              </w:rPr>
+              <w:t>Allows technical contribution and applied clinical relevance.</w:t>
+            </w:r>
+          </w:p>
+        </w:tc>
+      </w:tr>
+      <w:tr>
+        <w:tc>
+          <w:tcPr>
+            <w:tcW w:type="dxa" w:w="2448"/>
+            <w:vAlign w:val="center"/>
+          </w:tcPr>
+          <w:p>
+            <w:pPr>
+              <w:spacing w:after="0"/>
+            </w:pPr>
+            <w:r/>
+            <w:r>
+              <w:rPr>
+                <w:rFonts w:ascii="Calibri" w:hAnsi="Calibri"/>
+                <w:b w:val="0"/>
+                <w:sz w:val="18"/>
+              </w:rPr>
+              <w:t>Data feasibility</w:t>
+            </w:r>
+          </w:p>
+        </w:tc>
+        <w:tc>
+          <w:tcPr>
+            <w:tcW w:type="dxa" w:w="3240"/>
+            <w:vAlign w:val="center"/>
+          </w:tcPr>
+          <w:p>
+            <w:pPr>
+              <w:spacing w:after="0"/>
+            </w:pPr>
+            <w:r/>
+            <w:r>
+              <w:rPr>
+                <w:rFonts w:ascii="Calibri" w:hAnsi="Calibri"/>
+                <w:b w:val="0"/>
+                <w:sz w:val="18"/>
+              </w:rPr>
+              <w:t>Keep title flexible until clinic confirms variables.</w:t>
+            </w:r>
+          </w:p>
+        </w:tc>
+        <w:tc>
+          <w:tcPr>
+            <w:tcW w:type="dxa" w:w="3384"/>
+            <w:vAlign w:val="center"/>
+          </w:tcPr>
+          <w:p>
+            <w:pPr>
+              <w:spacing w:after="0"/>
+            </w:pPr>
+            <w:r/>
+            <w:r>
+              <w:rPr>
+                <w:rFonts w:ascii="Calibri" w:hAnsi="Calibri"/>
+                <w:b w:val="0"/>
+                <w:sz w:val="18"/>
+              </w:rPr>
+              <w:t>Avoids untestable claims.</w:t>
+            </w:r>
+          </w:p>
+        </w:tc>
+      </w:tr>
+      <w:tr>
+        <w:tc>
+          <w:tcPr>
+            <w:tcW w:type="dxa" w:w="2448"/>
+            <w:vAlign w:val="center"/>
+          </w:tcPr>
+          <w:p>
+            <w:pPr>
+              <w:spacing w:after="0"/>
+            </w:pPr>
+            <w:r/>
+            <w:r>
+              <w:rPr>
+                <w:rFonts w:ascii="Calibri" w:hAnsi="Calibri"/>
+                <w:b w:val="0"/>
+                <w:sz w:val="18"/>
+              </w:rPr>
+              <w:t>Safest outcome wording</w:t>
+            </w:r>
+          </w:p>
+        </w:tc>
+        <w:tc>
+          <w:tcPr>
+            <w:tcW w:type="dxa" w:w="3240"/>
+            <w:vAlign w:val="center"/>
+          </w:tcPr>
+          <w:p>
+            <w:pPr>
+              <w:spacing w:after="0"/>
+            </w:pPr>
+            <w:r/>
+            <w:r>
+              <w:rPr>
+                <w:rFonts w:ascii="Calibri" w:hAnsi="Calibri"/>
+                <w:b w:val="0"/>
+                <w:sz w:val="18"/>
+              </w:rPr>
+              <w:t>IVF outcome prediction.</w:t>
+            </w:r>
+          </w:p>
+        </w:tc>
+        <w:tc>
+          <w:tcPr>
+            <w:tcW w:type="dxa" w:w="3384"/>
+            <w:vAlign w:val="center"/>
+          </w:tcPr>
+          <w:p>
+            <w:pPr>
+              <w:spacing w:after="0"/>
+            </w:pPr>
+            <w:r/>
+            <w:r>
+              <w:rPr>
+                <w:rFonts w:ascii="Calibri" w:hAnsi="Calibri"/>
+                <w:b w:val="0"/>
+                <w:sz w:val="18"/>
+              </w:rPr>
+              <w:t>Can later become clinical pregnancy or live birth if data allows.</w:t>
+            </w:r>
+          </w:p>
+        </w:tc>
+      </w:tr>
+      <w:tr>
+        <w:tc>
+          <w:tcPr>
+            <w:tcW w:type="dxa" w:w="2448"/>
+            <w:vAlign w:val="center"/>
+          </w:tcPr>
+          <w:p>
+            <w:pPr>
+              <w:spacing w:after="0"/>
+            </w:pPr>
+            <w:r/>
+            <w:r>
+              <w:rPr>
+                <w:rFonts w:ascii="Calibri" w:hAnsi="Calibri"/>
+                <w:b w:val="0"/>
+                <w:sz w:val="18"/>
+              </w:rPr>
+              <w:t>Safest data wording</w:t>
+            </w:r>
+          </w:p>
+        </w:tc>
+        <w:tc>
+          <w:tcPr>
+            <w:tcW w:type="dxa" w:w="3240"/>
+            <w:vAlign w:val="center"/>
+          </w:tcPr>
+          <w:p>
+            <w:pPr>
+              <w:spacing w:after="0"/>
+            </w:pPr>
+            <w:r/>
+            <w:r>
+              <w:rPr>
+                <w:rFonts w:ascii="Calibri" w:hAnsi="Calibri"/>
+                <w:b w:val="0"/>
+                <w:sz w:val="18"/>
+              </w:rPr>
+              <w:t>Clinical and embryological data.</w:t>
+            </w:r>
+          </w:p>
+        </w:tc>
+        <w:tc>
+          <w:tcPr>
+            <w:tcW w:type="dxa" w:w="3384"/>
+            <w:vAlign w:val="center"/>
+          </w:tcPr>
+          <w:p>
+            <w:pPr>
+              <w:spacing w:after="0"/>
+            </w:pPr>
+            <w:r/>
+            <w:r>
+              <w:rPr>
+                <w:rFonts w:ascii="Calibri" w:hAnsi="Calibri"/>
+                <w:b w:val="0"/>
+                <w:sz w:val="18"/>
+              </w:rPr>
+              <w:t>Use only if embryology variables are confirmed; otherwise clinical data only.</w:t>
+            </w:r>
+          </w:p>
+        </w:tc>
+      </w:tr>
+      <w:tr>
+        <w:tc>
+          <w:tcPr>
+            <w:tcW w:type="dxa" w:w="2448"/>
+            <w:vAlign w:val="center"/>
+          </w:tcPr>
+          <w:p>
+            <w:pPr>
+              <w:spacing w:after="0"/>
+            </w:pPr>
+            <w:r/>
+            <w:r>
+              <w:rPr>
+                <w:rFonts w:ascii="Calibri" w:hAnsi="Calibri"/>
+                <w:b w:val="0"/>
+                <w:sz w:val="18"/>
+              </w:rPr>
+              <w:t>Safest contribution wording</w:t>
+            </w:r>
+          </w:p>
+        </w:tc>
+        <w:tc>
+          <w:tcPr>
+            <w:tcW w:type="dxa" w:w="3240"/>
+            <w:vAlign w:val="center"/>
+          </w:tcPr>
+          <w:p>
+            <w:pPr>
+              <w:spacing w:after="0"/>
+            </w:pPr>
+            <w:r/>
+            <w:r>
+              <w:rPr>
+                <w:rFonts w:ascii="Calibri" w:hAnsi="Calibri"/>
+                <w:b w:val="0"/>
+                <w:sz w:val="18"/>
+              </w:rPr>
+              <w:t>Decision-support framework.</w:t>
+            </w:r>
+          </w:p>
+        </w:tc>
+        <w:tc>
+          <w:tcPr>
+            <w:tcW w:type="dxa" w:w="3384"/>
+            <w:vAlign w:val="center"/>
+          </w:tcPr>
+          <w:p>
+            <w:pPr>
+              <w:spacing w:after="0"/>
+            </w:pPr>
+            <w:r/>
+            <w:r>
+              <w:rPr>
+                <w:rFonts w:ascii="Calibri" w:hAnsi="Calibri"/>
+                <w:b w:val="0"/>
+                <w:sz w:val="18"/>
+              </w:rPr>
+              <w:t>Avoids claiming autonomous decision-making or clinical deployment.</w:t>
             </w:r>
           </w:p>
         </w:tc>
@@ -393,7 +1314,7 @@
         <w:pStyle w:val="Heading1"/>
       </w:pPr>
       <w:r>
-        <w:t>Conditional Title Extensions</w:t>
+        <w:t>Fallback Titles By Dataset</w:t>
       </w:r>
     </w:p>
     <w:tbl>
@@ -410,7 +1331,283 @@
       <w:tr>
         <w:tc>
           <w:tcPr>
-            <w:tcW w:type="dxa" w:w="3456"/>
+            <w:tcW w:type="dxa" w:w="2952"/>
+            <w:shd w:fill="F2F4F7"/>
+            <w:vAlign w:val="center"/>
+          </w:tcPr>
+          <w:p>
+            <w:pPr>
+              <w:spacing w:after="0"/>
+            </w:pPr>
+            <w:r/>
+            <w:r>
+              <w:rPr>
+                <w:rFonts w:ascii="Calibri" w:hAnsi="Calibri"/>
+                <w:b/>
+                <w:sz w:val="18"/>
+              </w:rPr>
+              <w:t>Dataset Confirmed</w:t>
+            </w:r>
+          </w:p>
+        </w:tc>
+        <w:tc>
+          <w:tcPr>
+            <w:tcW w:type="dxa" w:w="6120"/>
+            <w:shd w:fill="F2F4F7"/>
+            <w:vAlign w:val="center"/>
+          </w:tcPr>
+          <w:p>
+            <w:pPr>
+              <w:spacing w:after="0"/>
+            </w:pPr>
+            <w:r/>
+            <w:r>
+              <w:rPr>
+                <w:rFonts w:ascii="Calibri" w:hAnsi="Calibri"/>
+                <w:b/>
+                <w:sz w:val="18"/>
+              </w:rPr>
+              <w:t>Safer Title Direction</w:t>
+            </w:r>
+          </w:p>
+        </w:tc>
+      </w:tr>
+      <w:tr>
+        <w:tc>
+          <w:tcPr>
+            <w:tcW w:type="dxa" w:w="2952"/>
+            <w:vAlign w:val="center"/>
+          </w:tcPr>
+          <w:p>
+            <w:pPr>
+              <w:spacing w:after="0"/>
+            </w:pPr>
+            <w:r/>
+            <w:r>
+              <w:rPr>
+                <w:rFonts w:ascii="Calibri" w:hAnsi="Calibri"/>
+                <w:b w:val="0"/>
+                <w:sz w:val="18"/>
+              </w:rPr>
+              <w:t>Clinical data only</w:t>
+            </w:r>
+          </w:p>
+        </w:tc>
+        <w:tc>
+          <w:tcPr>
+            <w:tcW w:type="dxa" w:w="6120"/>
+            <w:vAlign w:val="center"/>
+          </w:tcPr>
+          <w:p>
+            <w:pPr>
+              <w:spacing w:after="0"/>
+            </w:pPr>
+            <w:r/>
+            <w:r>
+              <w:rPr>
+                <w:rFonts w:ascii="Calibri" w:hAnsi="Calibri"/>
+                <w:b w:val="0"/>
+                <w:sz w:val="18"/>
+              </w:rPr>
+              <w:t>An Explainable Clinical Decision Support Framework for IVF Outcome Prediction Using Clinical Data.</w:t>
+            </w:r>
+          </w:p>
+        </w:tc>
+      </w:tr>
+      <w:tr>
+        <w:tc>
+          <w:tcPr>
+            <w:tcW w:type="dxa" w:w="2952"/>
+            <w:vAlign w:val="center"/>
+          </w:tcPr>
+          <w:p>
+            <w:pPr>
+              <w:spacing w:after="0"/>
+            </w:pPr>
+            <w:r/>
+            <w:r>
+              <w:rPr>
+                <w:rFonts w:ascii="Calibri" w:hAnsi="Calibri"/>
+                <w:b w:val="0"/>
+                <w:sz w:val="18"/>
+              </w:rPr>
+              <w:t>Clinical + embryology</w:t>
+            </w:r>
+          </w:p>
+        </w:tc>
+        <w:tc>
+          <w:tcPr>
+            <w:tcW w:type="dxa" w:w="6120"/>
+            <w:vAlign w:val="center"/>
+          </w:tcPr>
+          <w:p>
+            <w:pPr>
+              <w:spacing w:after="0"/>
+            </w:pPr>
+            <w:r/>
+            <w:r>
+              <w:rPr>
+                <w:rFonts w:ascii="Calibri" w:hAnsi="Calibri"/>
+                <w:b w:val="0"/>
+                <w:sz w:val="18"/>
+              </w:rPr>
+              <w:t>An Explainable and Personalized Clinical Decision Support Framework for IVF Outcome Prediction Using Multimodal Clinical and Embryological Data.</w:t>
+            </w:r>
+          </w:p>
+        </w:tc>
+      </w:tr>
+      <w:tr>
+        <w:tc>
+          <w:tcPr>
+            <w:tcW w:type="dxa" w:w="2952"/>
+            <w:vAlign w:val="center"/>
+          </w:tcPr>
+          <w:p>
+            <w:pPr>
+              <w:spacing w:after="0"/>
+            </w:pPr>
+            <w:r/>
+            <w:r>
+              <w:rPr>
+                <w:rFonts w:ascii="Calibri" w:hAnsi="Calibri"/>
+                <w:b w:val="0"/>
+                <w:sz w:val="18"/>
+              </w:rPr>
+              <w:t>Clinical + embryology + lifestyle</w:t>
+            </w:r>
+          </w:p>
+        </w:tc>
+        <w:tc>
+          <w:tcPr>
+            <w:tcW w:type="dxa" w:w="6120"/>
+            <w:vAlign w:val="center"/>
+          </w:tcPr>
+          <w:p>
+            <w:pPr>
+              <w:spacing w:after="0"/>
+            </w:pPr>
+            <w:r/>
+            <w:r>
+              <w:rPr>
+                <w:rFonts w:ascii="Calibri" w:hAnsi="Calibri"/>
+                <w:b w:val="0"/>
+                <w:sz w:val="18"/>
+              </w:rPr>
+              <w:t>An Explainable Multimodal Clinical Decision Support Framework for Personalized IVF Outcome Prediction Using Clinical, Embryological and Lifestyle Data.</w:t>
+            </w:r>
+          </w:p>
+        </w:tc>
+      </w:tr>
+      <w:tr>
+        <w:tc>
+          <w:tcPr>
+            <w:tcW w:type="dxa" w:w="2952"/>
+            <w:vAlign w:val="center"/>
+          </w:tcPr>
+          <w:p>
+            <w:pPr>
+              <w:spacing w:after="0"/>
+            </w:pPr>
+            <w:r/>
+            <w:r>
+              <w:rPr>
+                <w:rFonts w:ascii="Calibri" w:hAnsi="Calibri"/>
+                <w:b w:val="0"/>
+                <w:sz w:val="18"/>
+              </w:rPr>
+              <w:t>Live birth outcome confirmed</w:t>
+            </w:r>
+          </w:p>
+        </w:tc>
+        <w:tc>
+          <w:tcPr>
+            <w:tcW w:type="dxa" w:w="6120"/>
+            <w:vAlign w:val="center"/>
+          </w:tcPr>
+          <w:p>
+            <w:pPr>
+              <w:spacing w:after="0"/>
+            </w:pPr>
+            <w:r/>
+            <w:r>
+              <w:rPr>
+                <w:rFonts w:ascii="Calibri" w:hAnsi="Calibri"/>
+                <w:b w:val="0"/>
+                <w:sz w:val="18"/>
+              </w:rPr>
+              <w:t>Use live-birth prediction wording if follow-up and sample size are adequate.</w:t>
+            </w:r>
+          </w:p>
+        </w:tc>
+      </w:tr>
+      <w:tr>
+        <w:tc>
+          <w:tcPr>
+            <w:tcW w:type="dxa" w:w="2952"/>
+            <w:vAlign w:val="center"/>
+          </w:tcPr>
+          <w:p>
+            <w:pPr>
+              <w:spacing w:after="0"/>
+            </w:pPr>
+            <w:r/>
+            <w:r>
+              <w:rPr>
+                <w:rFonts w:ascii="Calibri" w:hAnsi="Calibri"/>
+                <w:b w:val="0"/>
+                <w:sz w:val="18"/>
+              </w:rPr>
+              <w:t>Only clinical pregnancy confirmed</w:t>
+            </w:r>
+          </w:p>
+        </w:tc>
+        <w:tc>
+          <w:tcPr>
+            <w:tcW w:type="dxa" w:w="6120"/>
+            <w:vAlign w:val="center"/>
+          </w:tcPr>
+          <w:p>
+            <w:pPr>
+              <w:spacing w:after="0"/>
+            </w:pPr>
+            <w:r/>
+            <w:r>
+              <w:rPr>
+                <w:rFonts w:ascii="Calibri" w:hAnsi="Calibri"/>
+                <w:b w:val="0"/>
+                <w:sz w:val="18"/>
+              </w:rPr>
+              <w:t>Use clinical pregnancy prediction wording, not live-birth prediction.</w:t>
+            </w:r>
+          </w:p>
+        </w:tc>
+      </w:tr>
+    </w:tbl>
+    <w:p/>
+    <w:p>
+      <w:pPr>
+        <w:pStyle w:val="Heading1"/>
+      </w:pPr>
+      <w:r>
+        <w:t>Conditional Title Extensions</w:t>
+      </w:r>
+    </w:p>
+    <w:tbl>
+      <w:tblPr>
+        <w:tblStyle w:val="TableGrid"/>
+        <w:tblW w:type="auto" w:w="0"/>
+        <w:jc w:val="center"/>
+        <w:tblLook w:firstColumn="1" w:firstRow="1" w:lastColumn="0" w:lastRow="0" w:noHBand="0" w:noVBand="1" w:val="04A0"/>
+      </w:tblPr>
+      <w:tblGrid>
+        <w:gridCol w:w="3120"/>
+        <w:gridCol w:w="3120"/>
+        <w:gridCol w:w="3120"/>
+      </w:tblGrid>
+      <w:tr>
+        <w:tc>
+          <w:tcPr>
+            <w:tcW w:type="dxa" w:w="2736"/>
             <w:shd w:fill="F2F4F7"/>
             <w:vAlign w:val="center"/>
           </w:tcPr>
@@ -431,7 +1628,7 @@
         </w:tc>
         <w:tc>
           <w:tcPr>
-            <w:tcW w:type="dxa" w:w="5616"/>
+            <w:tcW w:type="dxa" w:w="3240"/>
             <w:shd w:fill="F2F4F7"/>
             <w:vAlign w:val="center"/>
           </w:tcPr>
@@ -450,11 +1647,32 @@
             </w:r>
           </w:p>
         </w:tc>
+        <w:tc>
+          <w:tcPr>
+            <w:tcW w:type="dxa" w:w="3096"/>
+            <w:shd w:fill="F2F4F7"/>
+            <w:vAlign w:val="center"/>
+          </w:tcPr>
+          <w:p>
+            <w:pPr>
+              <w:spacing w:after="0"/>
+            </w:pPr>
+            <w:r/>
+            <w:r>
+              <w:rPr>
+                <w:rFonts w:ascii="Calibri" w:hAnsi="Calibri"/>
+                <w:b/>
+                <w:sz w:val="18"/>
+              </w:rPr>
+              <w:t>Avoid If</w:t>
+            </w:r>
+          </w:p>
+        </w:tc>
       </w:tr>
       <w:tr>
         <w:tc>
           <w:tcPr>
-            <w:tcW w:type="dxa" w:w="3456"/>
+            <w:tcW w:type="dxa" w:w="2736"/>
             <w:vAlign w:val="center"/>
           </w:tcPr>
           <w:p>
@@ -474,7 +1692,7 @@
         </w:tc>
         <w:tc>
           <w:tcPr>
-            <w:tcW w:type="dxa" w:w="5616"/>
+            <w:tcW w:type="dxa" w:w="3240"/>
             <w:vAlign w:val="center"/>
           </w:tcPr>
           <w:p>
@@ -492,11 +1710,31 @@
             </w:r>
           </w:p>
         </w:tc>
+        <w:tc>
+          <w:tcPr>
+            <w:tcW w:type="dxa" w:w="3096"/>
+            <w:vAlign w:val="center"/>
+          </w:tcPr>
+          <w:p>
+            <w:pPr>
+              <w:spacing w:after="0"/>
+            </w:pPr>
+            <w:r/>
+            <w:r>
+              <w:rPr>
+                <w:rFonts w:ascii="Calibri" w:hAnsi="Calibri"/>
+                <w:b w:val="0"/>
+                <w:sz w:val="18"/>
+              </w:rPr>
+              <w:t>Only literature support exists but no data access.</w:t>
+            </w:r>
+          </w:p>
+        </w:tc>
       </w:tr>
       <w:tr>
         <w:tc>
           <w:tcPr>
-            <w:tcW w:type="dxa" w:w="3456"/>
+            <w:tcW w:type="dxa" w:w="2736"/>
             <w:vAlign w:val="center"/>
           </w:tcPr>
           <w:p>
@@ -516,7 +1754,7 @@
         </w:tc>
         <w:tc>
           <w:tcPr>
-            <w:tcW w:type="dxa" w:w="5616"/>
+            <w:tcW w:type="dxa" w:w="3240"/>
             <w:vAlign w:val="center"/>
           </w:tcPr>
           <w:p>
@@ -534,11 +1772,31 @@
             </w:r>
           </w:p>
         </w:tc>
+        <w:tc>
+          <w:tcPr>
+            <w:tcW w:type="dxa" w:w="3096"/>
+            <w:vAlign w:val="center"/>
+          </w:tcPr>
+          <w:p>
+            <w:pPr>
+              <w:spacing w:after="0"/>
+            </w:pPr>
+            <w:r/>
+            <w:r>
+              <w:rPr>
+                <w:rFonts w:ascii="Calibri" w:hAnsi="Calibri"/>
+                <w:b w:val="0"/>
+                <w:sz w:val="18"/>
+              </w:rPr>
+              <w:t>Lifestyle data are absent or weak self-report.</w:t>
+            </w:r>
+          </w:p>
+        </w:tc>
       </w:tr>
       <w:tr>
         <w:tc>
           <w:tcPr>
-            <w:tcW w:type="dxa" w:w="3456"/>
+            <w:tcW w:type="dxa" w:w="2736"/>
             <w:vAlign w:val="center"/>
           </w:tcPr>
           <w:p>
@@ -558,7 +1816,7 @@
         </w:tc>
         <w:tc>
           <w:tcPr>
-            <w:tcW w:type="dxa" w:w="5616"/>
+            <w:tcW w:type="dxa" w:w="3240"/>
             <w:vAlign w:val="center"/>
           </w:tcPr>
           <w:p>
@@ -576,11 +1834,31 @@
             </w:r>
           </w:p>
         </w:tc>
+        <w:tc>
+          <w:tcPr>
+            <w:tcW w:type="dxa" w:w="3096"/>
+            <w:vAlign w:val="center"/>
+          </w:tcPr>
+          <w:p>
+            <w:pPr>
+              <w:spacing w:after="0"/>
+            </w:pPr>
+            <w:r/>
+            <w:r>
+              <w:rPr>
+                <w:rFonts w:ascii="Calibri" w:hAnsi="Calibri"/>
+                <w:b w:val="0"/>
+                <w:sz w:val="18"/>
+              </w:rPr>
+              <w:t>Only one-center internal split is available.</w:t>
+            </w:r>
+          </w:p>
+        </w:tc>
       </w:tr>
       <w:tr>
         <w:tc>
           <w:tcPr>
-            <w:tcW w:type="dxa" w:w="3456"/>
+            <w:tcW w:type="dxa" w:w="2736"/>
             <w:vAlign w:val="center"/>
           </w:tcPr>
           <w:p>
@@ -600,7 +1878,7 @@
         </w:tc>
         <w:tc>
           <w:tcPr>
-            <w:tcW w:type="dxa" w:w="5616"/>
+            <w:tcW w:type="dxa" w:w="3240"/>
             <w:vAlign w:val="center"/>
           </w:tcPr>
           <w:p>
@@ -615,6 +1893,376 @@
                 <w:sz w:val="18"/>
               </w:rPr>
               <w:t>Live-birth outcome is available with adequate follow-up.</w:t>
+            </w:r>
+          </w:p>
+        </w:tc>
+        <w:tc>
+          <w:tcPr>
+            <w:tcW w:type="dxa" w:w="3096"/>
+            <w:vAlign w:val="center"/>
+          </w:tcPr>
+          <w:p>
+            <w:pPr>
+              <w:spacing w:after="0"/>
+            </w:pPr>
+            <w:r/>
+            <w:r>
+              <w:rPr>
+                <w:rFonts w:ascii="Calibri" w:hAnsi="Calibri"/>
+                <w:b w:val="0"/>
+                <w:sz w:val="18"/>
+              </w:rPr>
+              <w:t>Only clinical pregnancy is available.</w:t>
+            </w:r>
+          </w:p>
+        </w:tc>
+      </w:tr>
+      <w:tr>
+        <w:tc>
+          <w:tcPr>
+            <w:tcW w:type="dxa" w:w="2736"/>
+            <w:vAlign w:val="center"/>
+          </w:tcPr>
+          <w:p>
+            <w:pPr>
+              <w:spacing w:after="0"/>
+            </w:pPr>
+            <w:r/>
+            <w:r>
+              <w:rPr>
+                <w:rFonts w:ascii="Calibri" w:hAnsi="Calibri"/>
+                <w:b w:val="0"/>
+                <w:sz w:val="18"/>
+              </w:rPr>
+              <w:t>Using Deep Learning</w:t>
+            </w:r>
+          </w:p>
+        </w:tc>
+        <w:tc>
+          <w:tcPr>
+            <w:tcW w:type="dxa" w:w="3240"/>
+            <w:vAlign w:val="center"/>
+          </w:tcPr>
+          <w:p>
+            <w:pPr>
+              <w:spacing w:after="0"/>
+            </w:pPr>
+            <w:r/>
+            <w:r>
+              <w:rPr>
+                <w:rFonts w:ascii="Calibri" w:hAnsi="Calibri"/>
+                <w:b w:val="0"/>
+                <w:sz w:val="18"/>
+              </w:rPr>
+              <w:t>Image, time-lapse or large-scale data justify deep learning.</w:t>
+            </w:r>
+          </w:p>
+        </w:tc>
+        <w:tc>
+          <w:tcPr>
+            <w:tcW w:type="dxa" w:w="3096"/>
+            <w:vAlign w:val="center"/>
+          </w:tcPr>
+          <w:p>
+            <w:pPr>
+              <w:spacing w:after="0"/>
+            </w:pPr>
+            <w:r/>
+            <w:r>
+              <w:rPr>
+                <w:rFonts w:ascii="Calibri" w:hAnsi="Calibri"/>
+                <w:b w:val="0"/>
+                <w:sz w:val="18"/>
+              </w:rPr>
+              <w:t>Only small structured tabular data are available.</w:t>
+            </w:r>
+          </w:p>
+        </w:tc>
+      </w:tr>
+    </w:tbl>
+    <w:p/>
+    <w:p>
+      <w:pPr>
+        <w:pStyle w:val="Heading1"/>
+      </w:pPr>
+      <w:r>
+        <w:t>Recommended Position To Tell Guide</w:t>
+      </w:r>
+    </w:p>
+    <w:p>
+      <w:r>
+        <w:t>The recommended position is to present one strongest working title and keep dataset-sensitive title words conditional. The strongest direction is explainable and personalized clinical decision support for IVF outcome prediction. The exact outcome, data modality and validation wording should be finalized after clinic discussion.</w:t>
+      </w:r>
+    </w:p>
+    <w:p>
+      <w:pPr>
+        <w:pStyle w:val="Heading1"/>
+      </w:pPr>
+      <w:r>
+        <w:t>What We Need From Guide</w:t>
+      </w:r>
+    </w:p>
+    <w:tbl>
+      <w:tblPr>
+        <w:tblStyle w:val="TableGrid"/>
+        <w:tblW w:type="auto" w:w="0"/>
+        <w:jc w:val="center"/>
+        <w:tblLook w:firstColumn="1" w:firstRow="1" w:lastColumn="0" w:lastRow="0" w:noHBand="0" w:noVBand="1" w:val="04A0"/>
+      </w:tblPr>
+      <w:tblGrid>
+        <w:gridCol w:w="4680"/>
+        <w:gridCol w:w="4680"/>
+      </w:tblGrid>
+      <w:tr>
+        <w:tc>
+          <w:tcPr>
+            <w:tcW w:type="dxa" w:w="3600"/>
+            <w:shd w:fill="F2F4F7"/>
+            <w:vAlign w:val="center"/>
+          </w:tcPr>
+          <w:p>
+            <w:pPr>
+              <w:spacing w:after="0"/>
+            </w:pPr>
+            <w:r/>
+            <w:r>
+              <w:rPr>
+                <w:rFonts w:ascii="Calibri" w:hAnsi="Calibri"/>
+                <w:b/>
+                <w:sz w:val="18"/>
+              </w:rPr>
+              <w:t>Guide Decision</w:t>
+            </w:r>
+          </w:p>
+        </w:tc>
+        <w:tc>
+          <w:tcPr>
+            <w:tcW w:type="dxa" w:w="5472"/>
+            <w:shd w:fill="F2F4F7"/>
+            <w:vAlign w:val="center"/>
+          </w:tcPr>
+          <w:p>
+            <w:pPr>
+              <w:spacing w:after="0"/>
+            </w:pPr>
+            <w:r/>
+            <w:r>
+              <w:rPr>
+                <w:rFonts w:ascii="Calibri" w:hAnsi="Calibri"/>
+                <w:b/>
+                <w:sz w:val="18"/>
+              </w:rPr>
+              <w:t>Why It Matters</w:t>
+            </w:r>
+          </w:p>
+        </w:tc>
+      </w:tr>
+      <w:tr>
+        <w:tc>
+          <w:tcPr>
+            <w:tcW w:type="dxa" w:w="3600"/>
+            <w:vAlign w:val="center"/>
+          </w:tcPr>
+          <w:p>
+            <w:pPr>
+              <w:spacing w:after="0"/>
+            </w:pPr>
+            <w:r/>
+            <w:r>
+              <w:rPr>
+                <w:rFonts w:ascii="Calibri" w:hAnsi="Calibri"/>
+                <w:b w:val="0"/>
+                <w:sz w:val="18"/>
+              </w:rPr>
+              <w:t>Should the topic focus on outcome prediction or ovarian stimulation decision support?</w:t>
+            </w:r>
+          </w:p>
+        </w:tc>
+        <w:tc>
+          <w:tcPr>
+            <w:tcW w:type="dxa" w:w="5472"/>
+            <w:vAlign w:val="center"/>
+          </w:tcPr>
+          <w:p>
+            <w:pPr>
+              <w:spacing w:after="0"/>
+            </w:pPr>
+            <w:r/>
+            <w:r>
+              <w:rPr>
+                <w:rFonts w:ascii="Calibri" w:hAnsi="Calibri"/>
+                <w:b w:val="0"/>
+                <w:sz w:val="18"/>
+              </w:rPr>
+              <w:t>This decides the required clinical variables and model target.</w:t>
+            </w:r>
+          </w:p>
+        </w:tc>
+      </w:tr>
+      <w:tr>
+        <w:tc>
+          <w:tcPr>
+            <w:tcW w:type="dxa" w:w="3600"/>
+            <w:vAlign w:val="center"/>
+          </w:tcPr>
+          <w:p>
+            <w:pPr>
+              <w:spacing w:after="0"/>
+            </w:pPr>
+            <w:r/>
+            <w:r>
+              <w:rPr>
+                <w:rFonts w:ascii="Calibri" w:hAnsi="Calibri"/>
+                <w:b w:val="0"/>
+                <w:sz w:val="18"/>
+              </w:rPr>
+              <w:t>Should the proposal title stay broad initially?</w:t>
+            </w:r>
+          </w:p>
+        </w:tc>
+        <w:tc>
+          <w:tcPr>
+            <w:tcW w:type="dxa" w:w="5472"/>
+            <w:vAlign w:val="center"/>
+          </w:tcPr>
+          <w:p>
+            <w:pPr>
+              <w:spacing w:after="0"/>
+            </w:pPr>
+            <w:r/>
+            <w:r>
+              <w:rPr>
+                <w:rFonts w:ascii="Calibri" w:hAnsi="Calibri"/>
+                <w:b w:val="0"/>
+                <w:sz w:val="18"/>
+              </w:rPr>
+              <w:t>This reduces risk before data access is confirmed.</w:t>
+            </w:r>
+          </w:p>
+        </w:tc>
+      </w:tr>
+      <w:tr>
+        <w:tc>
+          <w:tcPr>
+            <w:tcW w:type="dxa" w:w="3600"/>
+            <w:vAlign w:val="center"/>
+          </w:tcPr>
+          <w:p>
+            <w:pPr>
+              <w:spacing w:after="0"/>
+            </w:pPr>
+            <w:r/>
+            <w:r>
+              <w:rPr>
+                <w:rFonts w:ascii="Calibri" w:hAnsi="Calibri"/>
+                <w:b w:val="0"/>
+                <w:sz w:val="18"/>
+              </w:rPr>
+              <w:t>Should Indian validation be title wording or objective/future scope?</w:t>
+            </w:r>
+          </w:p>
+        </w:tc>
+        <w:tc>
+          <w:tcPr>
+            <w:tcW w:type="dxa" w:w="5472"/>
+            <w:vAlign w:val="center"/>
+          </w:tcPr>
+          <w:p>
+            <w:pPr>
+              <w:spacing w:after="0"/>
+            </w:pPr>
+            <w:r/>
+            <w:r>
+              <w:rPr>
+                <w:rFonts w:ascii="Calibri" w:hAnsi="Calibri"/>
+                <w:b w:val="0"/>
+                <w:sz w:val="18"/>
+              </w:rPr>
+              <w:t>This depends on likely Indian dataset access.</w:t>
+            </w:r>
+          </w:p>
+        </w:tc>
+      </w:tr>
+      <w:tr>
+        <w:tc>
+          <w:tcPr>
+            <w:tcW w:type="dxa" w:w="3600"/>
+            <w:vAlign w:val="center"/>
+          </w:tcPr>
+          <w:p>
+            <w:pPr>
+              <w:spacing w:after="0"/>
+            </w:pPr>
+            <w:r/>
+            <w:r>
+              <w:rPr>
+                <w:rFonts w:ascii="Calibri" w:hAnsi="Calibri"/>
+                <w:b w:val="0"/>
+                <w:sz w:val="18"/>
+              </w:rPr>
+              <w:t>Is CDSS/framework wording acceptable for the department?</w:t>
+            </w:r>
+          </w:p>
+        </w:tc>
+        <w:tc>
+          <w:tcPr>
+            <w:tcW w:type="dxa" w:w="5472"/>
+            <w:vAlign w:val="center"/>
+          </w:tcPr>
+          <w:p>
+            <w:pPr>
+              <w:spacing w:after="0"/>
+            </w:pPr>
+            <w:r/>
+            <w:r>
+              <w:rPr>
+                <w:rFonts w:ascii="Calibri" w:hAnsi="Calibri"/>
+                <w:b w:val="0"/>
+                <w:sz w:val="18"/>
+              </w:rPr>
+              <w:t>It positions the work beyond classifier comparison.</w:t>
+            </w:r>
+          </w:p>
+        </w:tc>
+      </w:tr>
+      <w:tr>
+        <w:tc>
+          <w:tcPr>
+            <w:tcW w:type="dxa" w:w="3600"/>
+            <w:vAlign w:val="center"/>
+          </w:tcPr>
+          <w:p>
+            <w:pPr>
+              <w:spacing w:after="0"/>
+            </w:pPr>
+            <w:r/>
+            <w:r>
+              <w:rPr>
+                <w:rFonts w:ascii="Calibri" w:hAnsi="Calibri"/>
+                <w:b w:val="0"/>
+                <w:sz w:val="18"/>
+              </w:rPr>
+              <w:t>Which words should be avoided in the first formal proposal?</w:t>
+            </w:r>
+          </w:p>
+        </w:tc>
+        <w:tc>
+          <w:tcPr>
+            <w:tcW w:type="dxa" w:w="5472"/>
+            <w:vAlign w:val="center"/>
+          </w:tcPr>
+          <w:p>
+            <w:pPr>
+              <w:spacing w:after="0"/>
+            </w:pPr>
+            <w:r/>
+            <w:r>
+              <w:rPr>
+                <w:rFonts w:ascii="Calibri" w:hAnsi="Calibri"/>
+                <w:b w:val="0"/>
+                <w:sz w:val="18"/>
+              </w:rPr>
+              <w:t>Prevents overclaiming before feasibility is known.</w:t>
             </w:r>
           </w:p>
         </w:tc>

</xml_diff>